<commit_message>
docs(prd): unify fonts (SimSun + Times New Roman) and move diagrams to appendix
</commit_message>
<xml_diff>
--- a/PRD文档/宠物店智能问诊与运营助手PRD.docx
+++ b/PRD文档/宠物店智能问诊与运营助手PRD.docx
@@ -993,7 +993,7 @@
       </w:r>
     </w:p>
     <w:bookmarkEnd w:id="13"/>
-    <w:bookmarkStart w:id="17" w:name="产品定位与整体方案"/>
+    <w:bookmarkStart w:id="14" w:name="产品定位与整体方案"/>
     <w:p>
       <w:pPr>
         <w:pStyle w:val="Heading2"/>
@@ -1170,63 +1170,60 @@
     </w:p>
     <w:p>
       <w:pPr>
-        <w:pStyle w:val="CaptionedFigure"/>
-      </w:pPr>
-      <w:r>
-        <w:drawing>
-          <wp:inline>
-            <wp:extent cx="2773680" cy="6810925"/>
-            <wp:effectExtent b="0" l="0" r="0" t="0"/>
-            <wp:docPr descr="流程图 1" title="" id="15" name="Picture"/>
-            <a:graphic>
-              <a:graphicData uri="http://schemas.openxmlformats.org/drawingml/2006/picture">
-                <pic:pic>
-                  <pic:nvPicPr>
-                    <pic:cNvPr descr="../流程图/主接诊流程图.png" id="16" name="Picture"/>
-                    <pic:cNvPicPr>
-                      <a:picLocks noChangeArrowheads="1" noChangeAspect="1"/>
-                    </pic:cNvPicPr>
-                  </pic:nvPicPr>
-                  <pic:blipFill>
-                    <a:blip r:embed="rId14"/>
-                    <a:stretch>
-                      <a:fillRect/>
-                    </a:stretch>
-                  </pic:blipFill>
-                  <pic:spPr bwMode="auto">
-                    <a:xfrm>
-                      <a:off x="0" y="0"/>
-                      <a:ext cx="2773680" cy="6810925"/>
-                    </a:xfrm>
-                    <a:prstGeom prst="rect">
-                      <a:avLst/>
-                    </a:prstGeom>
-                    <a:noFill/>
-                    <a:ln w="9525">
-                      <a:noFill/>
-                      <a:headEnd/>
-                      <a:tailEnd/>
-                    </a:ln>
-                  </pic:spPr>
-                </pic:pic>
-              </a:graphicData>
-            </a:graphic>
-          </wp:inline>
-        </w:drawing>
-      </w:r>
-    </w:p>
-    <w:p>
-      <w:pPr>
-        <w:pStyle w:val="ImageCaption"/>
-      </w:pPr>
-      <w:r>
-        <w:rPr>
-          <w:rFonts w:hint="eastAsia"/>
-        </w:rPr>
-        <w:t xml:space="preserve">流程图</w:t>
-      </w:r>
-      <w:r>
-        <w:t xml:space="preserve"> 1</w:t>
+        <w:pStyle w:val="BodyText"/>
+      </w:pPr>
+      <w:r>
+        <w:rPr>
+          <w:rFonts w:hint="eastAsia"/>
+          <w:i/>
+          <w:iCs/>
+        </w:rPr>
+        <w:t xml:space="preserve">（配图见</w:t>
+      </w:r>
+      <w:r>
+        <w:rPr>
+          <w:i/>
+          <w:iCs/>
+        </w:rPr>
+        <w:t xml:space="preserve"> </w:t>
+      </w:r>
+      <w:r>
+        <w:rPr>
+          <w:rFonts w:hint="eastAsia"/>
+          <w:i/>
+          <w:iCs/>
+        </w:rPr>
+        <w:t xml:space="preserve">附录</w:t>
+      </w:r>
+      <w:r>
+        <w:rPr>
+          <w:i/>
+          <w:iCs/>
+        </w:rPr>
+        <w:t xml:space="preserve"> B · </w:t>
+      </w:r>
+      <w:r>
+        <w:rPr>
+          <w:rFonts w:hint="eastAsia"/>
+          <w:i/>
+          <w:iCs/>
+        </w:rPr>
+        <w:t xml:space="preserve">图</w:t>
+      </w:r>
+      <w:r>
+        <w:rPr>
+          <w:i/>
+          <w:iCs/>
+        </w:rPr>
+        <w:t xml:space="preserve"> </w:t>
+      </w:r>
+      <w:r>
+        <w:rPr>
+          <w:rFonts w:hint="eastAsia"/>
+          <w:i/>
+          <w:iCs/>
+        </w:rPr>
+        <w:t xml:space="preserve">1）</w:t>
       </w:r>
     </w:p>
     <w:p>
@@ -1236,8 +1233,8 @@
         </w:pict>
       </w:r>
     </w:p>
-    <w:bookmarkEnd w:id="17"/>
-    <w:bookmarkStart w:id="21" w:name="功能需求"/>
+    <w:bookmarkEnd w:id="14"/>
+    <w:bookmarkStart w:id="18" w:name="功能需求"/>
     <w:p>
       <w:pPr>
         <w:pStyle w:val="Heading2"/>
@@ -1252,7 +1249,7 @@
         <w:t xml:space="preserve">功能需求</w:t>
       </w:r>
     </w:p>
-    <w:bookmarkStart w:id="18" w:name="功能总览"/>
+    <w:bookmarkStart w:id="15" w:name="功能总览"/>
     <w:p>
       <w:pPr>
         <w:pStyle w:val="Heading3"/>
@@ -2234,8 +2231,8 @@
         </w:tc>
       </w:tr>
     </w:tbl>
-    <w:bookmarkEnd w:id="18"/>
-    <w:bookmarkStart w:id="19" w:name="关键功能说明"/>
+    <w:bookmarkEnd w:id="15"/>
+    <w:bookmarkStart w:id="16" w:name="关键功能说明"/>
     <w:p>
       <w:pPr>
         <w:pStyle w:val="Heading3"/>
@@ -2483,8 +2480,8 @@
         <w:t xml:space="preserve"> A。</w:t>
       </w:r>
     </w:p>
-    <w:bookmarkEnd w:id="19"/>
-    <w:bookmarkStart w:id="20" w:name="权限矩阵简"/>
+    <w:bookmarkEnd w:id="16"/>
+    <w:bookmarkStart w:id="17" w:name="权限矩阵简"/>
     <w:p>
       <w:pPr>
         <w:pStyle w:val="Heading3"/>
@@ -2988,9 +2985,9 @@
         </w:pict>
       </w:r>
     </w:p>
-    <w:bookmarkEnd w:id="20"/>
-    <w:bookmarkEnd w:id="21"/>
-    <w:bookmarkStart w:id="25" w:name="ai-能力设计"/>
+    <w:bookmarkEnd w:id="17"/>
+    <w:bookmarkEnd w:id="18"/>
+    <w:bookmarkStart w:id="19" w:name="ai-能力设计"/>
     <w:p>
       <w:pPr>
         <w:pStyle w:val="Heading2"/>
@@ -3290,63 +3287,60 @@
     </w:p>
     <w:p>
       <w:pPr>
-        <w:pStyle w:val="CaptionedFigure"/>
-      </w:pPr>
-      <w:r>
-        <w:drawing>
-          <wp:inline>
-            <wp:extent cx="4907280" cy="6050797"/>
-            <wp:effectExtent b="0" l="0" r="0" t="0"/>
-            <wp:docPr descr="流程图 2" title="" id="23" name="Picture"/>
-            <a:graphic>
-              <a:graphicData uri="http://schemas.openxmlformats.org/drawingml/2006/picture">
-                <pic:pic>
-                  <pic:nvPicPr>
-                    <pic:cNvPr descr="../流程图/系统架构图.png" id="24" name="Picture"/>
-                    <pic:cNvPicPr>
-                      <a:picLocks noChangeArrowheads="1" noChangeAspect="1"/>
-                    </pic:cNvPicPr>
-                  </pic:nvPicPr>
-                  <pic:blipFill>
-                    <a:blip r:embed="rId22"/>
-                    <a:stretch>
-                      <a:fillRect/>
-                    </a:stretch>
-                  </pic:blipFill>
-                  <pic:spPr bwMode="auto">
-                    <a:xfrm>
-                      <a:off x="0" y="0"/>
-                      <a:ext cx="4907280" cy="6050797"/>
-                    </a:xfrm>
-                    <a:prstGeom prst="rect">
-                      <a:avLst/>
-                    </a:prstGeom>
-                    <a:noFill/>
-                    <a:ln w="9525">
-                      <a:noFill/>
-                      <a:headEnd/>
-                      <a:tailEnd/>
-                    </a:ln>
-                  </pic:spPr>
-                </pic:pic>
-              </a:graphicData>
-            </a:graphic>
-          </wp:inline>
-        </w:drawing>
-      </w:r>
-    </w:p>
-    <w:p>
-      <w:pPr>
-        <w:pStyle w:val="ImageCaption"/>
-      </w:pPr>
-      <w:r>
-        <w:rPr>
-          <w:rFonts w:hint="eastAsia"/>
-        </w:rPr>
-        <w:t xml:space="preserve">流程图</w:t>
-      </w:r>
-      <w:r>
-        <w:t xml:space="preserve"> 2</w:t>
+        <w:pStyle w:val="BodyText"/>
+      </w:pPr>
+      <w:r>
+        <w:rPr>
+          <w:rFonts w:hint="eastAsia"/>
+          <w:i/>
+          <w:iCs/>
+        </w:rPr>
+        <w:t xml:space="preserve">（配图见</w:t>
+      </w:r>
+      <w:r>
+        <w:rPr>
+          <w:i/>
+          <w:iCs/>
+        </w:rPr>
+        <w:t xml:space="preserve"> </w:t>
+      </w:r>
+      <w:r>
+        <w:rPr>
+          <w:rFonts w:hint="eastAsia"/>
+          <w:i/>
+          <w:iCs/>
+        </w:rPr>
+        <w:t xml:space="preserve">附录</w:t>
+      </w:r>
+      <w:r>
+        <w:rPr>
+          <w:i/>
+          <w:iCs/>
+        </w:rPr>
+        <w:t xml:space="preserve"> B · </w:t>
+      </w:r>
+      <w:r>
+        <w:rPr>
+          <w:rFonts w:hint="eastAsia"/>
+          <w:i/>
+          <w:iCs/>
+        </w:rPr>
+        <w:t xml:space="preserve">图</w:t>
+      </w:r>
+      <w:r>
+        <w:rPr>
+          <w:i/>
+          <w:iCs/>
+        </w:rPr>
+        <w:t xml:space="preserve"> </w:t>
+      </w:r>
+      <w:r>
+        <w:rPr>
+          <w:rFonts w:hint="eastAsia"/>
+          <w:i/>
+          <w:iCs/>
+        </w:rPr>
+        <w:t xml:space="preserve">2）</w:t>
       </w:r>
     </w:p>
     <w:p>
@@ -3356,8 +3350,8 @@
         </w:pict>
       </w:r>
     </w:p>
-    <w:bookmarkEnd w:id="25"/>
-    <w:bookmarkStart w:id="26" w:name="非功能需求"/>
+    <w:bookmarkEnd w:id="19"/>
+    <w:bookmarkStart w:id="20" w:name="非功能需求"/>
     <w:p>
       <w:pPr>
         <w:pStyle w:val="Heading2"/>
@@ -3619,8 +3613,8 @@
         </w:pict>
       </w:r>
     </w:p>
-    <w:bookmarkEnd w:id="26"/>
-    <w:bookmarkStart w:id="27" w:name="项目里程碑"/>
+    <w:bookmarkEnd w:id="20"/>
+    <w:bookmarkStart w:id="21" w:name="项目里程碑"/>
     <w:p>
       <w:pPr>
         <w:pStyle w:val="Heading2"/>
@@ -4043,8 +4037,8 @@
         </w:pict>
       </w:r>
     </w:p>
-    <w:bookmarkEnd w:id="27"/>
-    <w:bookmarkStart w:id="28" w:name="风险与应对"/>
+    <w:bookmarkEnd w:id="21"/>
+    <w:bookmarkStart w:id="22" w:name="风险与应对"/>
     <w:p>
       <w:pPr>
         <w:pStyle w:val="Heading2"/>
@@ -4394,8 +4388,8 @@
         </w:pict>
       </w:r>
     </w:p>
-    <w:bookmarkEnd w:id="28"/>
-    <w:bookmarkStart w:id="29" w:name="验收标准与开放问题"/>
+    <w:bookmarkEnd w:id="22"/>
+    <w:bookmarkStart w:id="23" w:name="验收标准与开放问题"/>
     <w:p>
       <w:pPr>
         <w:pStyle w:val="Heading2"/>
@@ -4638,8 +4632,8 @@
         </w:pict>
       </w:r>
     </w:p>
-    <w:bookmarkEnd w:id="29"/>
-    <w:bookmarkStart w:id="38" w:name="附录"/>
+    <w:bookmarkEnd w:id="23"/>
+    <w:bookmarkStart w:id="39" w:name="附录"/>
     <w:p>
       <w:pPr>
         <w:pStyle w:val="Heading2"/>
@@ -4651,7 +4645,7 @@
         <w:t xml:space="preserve">附录</w:t>
       </w:r>
     </w:p>
-    <w:bookmarkStart w:id="36" w:name="a.-界面原型"/>
+    <w:bookmarkStart w:id="30" w:name="a.-界面原型"/>
     <w:p>
       <w:pPr>
         <w:pStyle w:val="Heading3"/>
@@ -4701,20 +4695,20 @@
       <w:r>
         <w:drawing>
           <wp:inline>
-            <wp:extent cx="5334000" cy="3333750"/>
+            <wp:extent cx="3840480" cy="2400300"/>
             <wp:effectExtent b="0" l="0" r="0" t="0"/>
-            <wp:docPr descr="店员工作台原型" title="" id="31" name="Picture"/>
+            <wp:docPr descr="店员工作台原型" title="" id="25" name="Picture"/>
             <a:graphic>
               <a:graphicData uri="http://schemas.openxmlformats.org/drawingml/2006/picture">
                 <pic:pic>
                   <pic:nvPicPr>
-                    <pic:cNvPr descr="../原型图/店员工作台原型.png" id="32" name="Picture"/>
+                    <pic:cNvPr descr="../原型图/店员工作台原型.png" id="26" name="Picture"/>
                     <pic:cNvPicPr>
                       <a:picLocks noChangeArrowheads="1" noChangeAspect="1"/>
                     </pic:cNvPicPr>
                   </pic:nvPicPr>
                   <pic:blipFill>
-                    <a:blip r:embed="rId30"/>
+                    <a:blip r:embed="rId24"/>
                     <a:stretch>
                       <a:fillRect/>
                     </a:stretch>
@@ -4722,7 +4716,7 @@
                   <pic:spPr bwMode="auto">
                     <a:xfrm>
                       <a:off x="0" y="0"/>
-                      <a:ext cx="5334000" cy="3333750"/>
+                      <a:ext cx="3840480" cy="2400300"/>
                     </a:xfrm>
                     <a:prstGeom prst="rect">
                       <a:avLst/>
@@ -4787,20 +4781,20 @@
       <w:r>
         <w:drawing>
           <wp:inline>
-            <wp:extent cx="3307080" cy="6929120"/>
+            <wp:extent cx="1706880" cy="3576320"/>
             <wp:effectExtent b="0" l="0" r="0" t="0"/>
-            <wp:docPr descr="顾客端小程序原型" title="" id="34" name="Picture"/>
+            <wp:docPr descr="顾客端小程序原型" title="" id="28" name="Picture"/>
             <a:graphic>
               <a:graphicData uri="http://schemas.openxmlformats.org/drawingml/2006/picture">
                 <pic:pic>
                   <pic:nvPicPr>
-                    <pic:cNvPr descr="../原型图/顾客端小程序原型.png" id="35" name="Picture"/>
+                    <pic:cNvPr descr="../原型图/顾客端小程序原型.png" id="29" name="Picture"/>
                     <pic:cNvPicPr>
                       <a:picLocks noChangeArrowheads="1" noChangeAspect="1"/>
                     </pic:cNvPicPr>
                   </pic:nvPicPr>
                   <pic:blipFill>
-                    <a:blip r:embed="rId33"/>
+                    <a:blip r:embed="rId27"/>
                     <a:stretch>
                       <a:fillRect/>
                     </a:stretch>
@@ -4808,7 +4802,7 @@
                   <pic:spPr bwMode="auto">
                     <a:xfrm>
                       <a:off x="0" y="0"/>
-                      <a:ext cx="3307080" cy="6929120"/>
+                      <a:ext cx="1706880" cy="3576320"/>
                     </a:xfrm>
                     <a:prstGeom prst="rect">
                       <a:avLst/>
@@ -4838,14 +4832,164 @@
         <w:t xml:space="preserve">顾客端小程序原型</w:t>
       </w:r>
     </w:p>
-    <w:bookmarkEnd w:id="36"/>
-    <w:bookmarkStart w:id="37" w:name="b.-现有实现映射"/>
+    <w:bookmarkEnd w:id="30"/>
+    <w:bookmarkStart w:id="37" w:name="b.-流程图"/>
     <w:p>
       <w:pPr>
         <w:pStyle w:val="Heading3"/>
       </w:pPr>
       <w:r>
         <w:t xml:space="preserve">B. </w:t>
+      </w:r>
+      <w:r>
+        <w:rPr>
+          <w:rFonts w:hint="eastAsia"/>
+        </w:rPr>
+        <w:t xml:space="preserve">流程图</w:t>
+      </w:r>
+    </w:p>
+    <w:p>
+      <w:pPr>
+        <w:pStyle w:val="CaptionedFigure"/>
+      </w:pPr>
+      <w:r>
+        <w:drawing>
+          <wp:inline>
+            <wp:extent cx="2720340" cy="6679946"/>
+            <wp:effectExtent b="0" l="0" r="0" t="0"/>
+            <wp:docPr descr="图 1 主接诊流程图" title="" id="32" name="Picture"/>
+            <a:graphic>
+              <a:graphicData uri="http://schemas.openxmlformats.org/drawingml/2006/picture">
+                <pic:pic>
+                  <pic:nvPicPr>
+                    <pic:cNvPr descr="../流程图/主接诊流程图.png" id="33" name="Picture"/>
+                    <pic:cNvPicPr>
+                      <a:picLocks noChangeArrowheads="1" noChangeAspect="1"/>
+                    </pic:cNvPicPr>
+                  </pic:nvPicPr>
+                  <pic:blipFill>
+                    <a:blip r:embed="rId31"/>
+                    <a:stretch>
+                      <a:fillRect/>
+                    </a:stretch>
+                  </pic:blipFill>
+                  <pic:spPr bwMode="auto">
+                    <a:xfrm>
+                      <a:off x="0" y="0"/>
+                      <a:ext cx="2720340" cy="6679946"/>
+                    </a:xfrm>
+                    <a:prstGeom prst="rect">
+                      <a:avLst/>
+                    </a:prstGeom>
+                    <a:noFill/>
+                    <a:ln w="9525">
+                      <a:noFill/>
+                      <a:headEnd/>
+                      <a:tailEnd/>
+                    </a:ln>
+                  </pic:spPr>
+                </pic:pic>
+              </a:graphicData>
+            </a:graphic>
+          </wp:inline>
+        </w:drawing>
+      </w:r>
+    </w:p>
+    <w:p>
+      <w:pPr>
+        <w:pStyle w:val="ImageCaption"/>
+      </w:pPr>
+      <w:r>
+        <w:rPr>
+          <w:rFonts w:hint="eastAsia"/>
+        </w:rPr>
+        <w:t xml:space="preserve">图</w:t>
+      </w:r>
+      <w:r>
+        <w:t xml:space="preserve"> 1 </w:t>
+      </w:r>
+      <w:r>
+        <w:rPr>
+          <w:rFonts w:hint="eastAsia"/>
+        </w:rPr>
+        <w:t xml:space="preserve">主接诊流程图</w:t>
+      </w:r>
+    </w:p>
+    <w:p>
+      <w:pPr>
+        <w:pStyle w:val="CaptionedFigure"/>
+      </w:pPr>
+      <w:r>
+        <w:drawing>
+          <wp:inline>
+            <wp:extent cx="3467100" cy="4275019"/>
+            <wp:effectExtent b="0" l="0" r="0" t="0"/>
+            <wp:docPr descr="图 2 系统架构图" title="" id="35" name="Picture"/>
+            <a:graphic>
+              <a:graphicData uri="http://schemas.openxmlformats.org/drawingml/2006/picture">
+                <pic:pic>
+                  <pic:nvPicPr>
+                    <pic:cNvPr descr="../流程图/系统架构图.png" id="36" name="Picture"/>
+                    <pic:cNvPicPr>
+                      <a:picLocks noChangeArrowheads="1" noChangeAspect="1"/>
+                    </pic:cNvPicPr>
+                  </pic:nvPicPr>
+                  <pic:blipFill>
+                    <a:blip r:embed="rId34"/>
+                    <a:stretch>
+                      <a:fillRect/>
+                    </a:stretch>
+                  </pic:blipFill>
+                  <pic:spPr bwMode="auto">
+                    <a:xfrm>
+                      <a:off x="0" y="0"/>
+                      <a:ext cx="3467100" cy="4275019"/>
+                    </a:xfrm>
+                    <a:prstGeom prst="rect">
+                      <a:avLst/>
+                    </a:prstGeom>
+                    <a:noFill/>
+                    <a:ln w="9525">
+                      <a:noFill/>
+                      <a:headEnd/>
+                      <a:tailEnd/>
+                    </a:ln>
+                  </pic:spPr>
+                </pic:pic>
+              </a:graphicData>
+            </a:graphic>
+          </wp:inline>
+        </w:drawing>
+      </w:r>
+    </w:p>
+    <w:p>
+      <w:pPr>
+        <w:pStyle w:val="ImageCaption"/>
+      </w:pPr>
+      <w:r>
+        <w:rPr>
+          <w:rFonts w:hint="eastAsia"/>
+        </w:rPr>
+        <w:t xml:space="preserve">图</w:t>
+      </w:r>
+      <w:r>
+        <w:t xml:space="preserve"> 2 </w:t>
+      </w:r>
+      <w:r>
+        <w:rPr>
+          <w:rFonts w:hint="eastAsia"/>
+        </w:rPr>
+        <w:t xml:space="preserve">系统架构图</w:t>
+      </w:r>
+    </w:p>
+    <w:bookmarkEnd w:id="37"/>
+    <w:bookmarkStart w:id="38" w:name="c.-现有实现映射"/>
+    <w:p>
+      <w:pPr>
+        <w:pStyle w:val="Heading3"/>
+      </w:pPr>
+      <w:r>
+        <w:t xml:space="preserve">C. </w:t>
       </w:r>
       <w:r>
         <w:rPr>
@@ -5234,8 +5378,8 @@
         <w:t xml:space="preserve">本文档为产品规划，涉及医疗建议的部分均不构成诊断或处方，实际诊疗须由执业兽医实施。</w:t>
       </w:r>
     </w:p>
-    <w:bookmarkEnd w:id="37"/>
     <w:bookmarkEnd w:id="38"/>
+    <w:bookmarkEnd w:id="39"/>
     <w:sectPr>
       <w:footnotePr>
         <w:numRestart w:val="eachSect"/>
@@ -5581,7 +5725,7 @@
   <w:docDefaults>
     <w:rPrDefault>
       <w:rPr>
-        <w:rFonts w:asciiTheme="minorHAnsi" w:cstheme="minorBidi" w:eastAsiaTheme="minorEastAsia" w:hAnsiTheme="minorHAnsi"/>
+        <w:rFonts w:ascii="Times New Roman" w:cs="Times New Roman" w:eastAsia="宋体" w:hAnsi="Times New Roman"/>
         <w:sz w:val="24"/>
         <w:szCs w:val="24"/>
         <w:lang w:bidi="ar-SA" w:eastAsia="zh-CN" w:val="en-US"/>
@@ -5635,7 +5779,7 @@
       <w:jc w:val="center"/>
     </w:pPr>
     <w:rPr>
-      <w:rFonts w:asciiTheme="majorHAnsi" w:cstheme="majorBidi" w:eastAsiaTheme="majorEastAsia" w:hAnsiTheme="majorHAnsi"/>
+      <w:rFonts w:ascii="Times New Roman" w:cs="Times New Roman" w:eastAsia="宋体" w:hAnsi="Times New Roman"/>
       <w:sz w:val="56"/>
       <w:szCs w:val="56"/>
     </w:rPr>
@@ -5647,7 +5791,7 @@
     <w:uiPriority w:val="10"/>
     <w:rsid w:val="00A10FD9"/>
     <w:rPr>
-      <w:rFonts w:asciiTheme="majorHAnsi" w:cstheme="majorBidi" w:eastAsiaTheme="majorEastAsia" w:hAnsiTheme="majorHAnsi"/>
+      <w:rFonts w:ascii="Times New Roman" w:cs="Times New Roman" w:eastAsia="宋体" w:hAnsi="Times New Roman"/>
       <w:sz w:val="56"/>
       <w:szCs w:val="56"/>
     </w:rPr>
@@ -5666,7 +5810,7 @@
       </w:numPr>
     </w:pPr>
     <w:rPr>
-      <w:rFonts w:cstheme="majorBidi" w:eastAsiaTheme="majorEastAsia"/>
+      <w:rFonts w:ascii="Times New Roman" w:cs="Times New Roman" w:eastAsia="宋体" w:hAnsi="Times New Roman"/>
       <w:spacing w:val="15"/>
       <w:sz w:val="28"/>
       <w:szCs w:val="28"/>
@@ -5679,7 +5823,7 @@
     <w:uiPriority w:val="11"/>
     <w:rsid w:val="00A10FD9"/>
     <w:rPr>
-      <w:rFonts w:cstheme="majorBidi" w:eastAsiaTheme="majorEastAsia"/>
+      <w:rFonts w:ascii="Times New Roman" w:cs="Times New Roman" w:eastAsia="宋体" w:hAnsi="Times New Roman"/>
       <w:color w:themeColor="text1" w:themeTint="A6" w:val="595959"/>
       <w:spacing w:val="15"/>
       <w:sz w:val="28"/>
@@ -5769,7 +5913,7 @@
       <w:outlineLvl w:val="0"/>
     </w:pPr>
     <w:rPr>
-      <w:rFonts w:asciiTheme="majorHAnsi" w:cstheme="majorBidi" w:eastAsiaTheme="majorEastAsia" w:hAnsiTheme="majorHAnsi"/>
+      <w:rFonts w:ascii="Times New Roman" w:cs="Times New Roman" w:eastAsia="宋体" w:hAnsi="Times New Roman"/>
       <w:color w:themeColor="accent1" w:themeShade="BF" w:val="0F4761"/>
       <w:sz w:val="40"/>
       <w:szCs w:val="40"/>
@@ -5792,7 +5936,7 @@
       <w:outlineLvl w:val="1"/>
     </w:pPr>
     <w:rPr>
-      <w:rFonts w:asciiTheme="majorHAnsi" w:cstheme="majorBidi" w:eastAsiaTheme="majorEastAsia" w:hAnsiTheme="majorHAnsi"/>
+      <w:rFonts w:ascii="Times New Roman" w:cs="Times New Roman" w:eastAsia="宋体" w:hAnsi="Times New Roman"/>
       <w:color w:themeColor="accent1" w:themeShade="BF" w:val="0F4761"/>
       <w:sz w:val="32"/>
       <w:szCs w:val="32"/>
@@ -5815,7 +5959,7 @@
       <w:outlineLvl w:val="2"/>
     </w:pPr>
     <w:rPr>
-      <w:rFonts w:cstheme="majorBidi" w:eastAsiaTheme="majorEastAsia"/>
+      <w:rFonts w:ascii="Times New Roman" w:cs="Times New Roman" w:eastAsia="宋体" w:hAnsi="Times New Roman"/>
       <w:color w:themeColor="accent1" w:themeShade="BF" w:val="0F4761"/>
       <w:sz w:val="28"/>
       <w:szCs w:val="28"/>
@@ -5838,7 +5982,7 @@
       <w:outlineLvl w:val="3"/>
     </w:pPr>
     <w:rPr>
-      <w:rFonts w:cstheme="majorBidi" w:eastAsiaTheme="majorEastAsia"/>
+      <w:rFonts w:ascii="Times New Roman" w:cs="Times New Roman" w:eastAsia="宋体" w:hAnsi="Times New Roman"/>
       <w:i/>
       <w:iCs/>
       <w:color w:themeColor="accent1" w:themeShade="BF" w:val="0F4761"/>
@@ -5861,7 +6005,7 @@
       <w:outlineLvl w:val="4"/>
     </w:pPr>
     <w:rPr>
-      <w:rFonts w:cstheme="majorBidi" w:eastAsiaTheme="majorEastAsia"/>
+      <w:rFonts w:ascii="Times New Roman" w:cs="Times New Roman" w:eastAsia="宋体" w:hAnsi="Times New Roman"/>
       <w:color w:themeColor="accent1" w:themeShade="BF" w:val="0F4761"/>
     </w:rPr>
   </w:style>
@@ -5882,7 +6026,7 @@
       <w:outlineLvl w:val="5"/>
     </w:pPr>
     <w:rPr>
-      <w:rFonts w:cstheme="majorBidi" w:eastAsiaTheme="majorEastAsia"/>
+      <w:rFonts w:ascii="Times New Roman" w:cs="Times New Roman" w:eastAsia="宋体" w:hAnsi="Times New Roman"/>
       <w:i/>
       <w:iCs/>
       <w:color w:themeColor="text1" w:themeTint="A6" w:val="595959"/>
@@ -5905,7 +6049,7 @@
       <w:outlineLvl w:val="6"/>
     </w:pPr>
     <w:rPr>
-      <w:rFonts w:cstheme="majorBidi" w:eastAsiaTheme="majorEastAsia"/>
+      <w:rFonts w:ascii="Times New Roman" w:cs="Times New Roman" w:eastAsia="宋体" w:hAnsi="Times New Roman"/>
       <w:color w:themeColor="text1" w:themeTint="A6" w:val="595959"/>
     </w:rPr>
   </w:style>
@@ -5926,7 +6070,7 @@
       <w:outlineLvl w:val="7"/>
     </w:pPr>
     <w:rPr>
-      <w:rFonts w:cstheme="majorBidi" w:eastAsiaTheme="majorEastAsia"/>
+      <w:rFonts w:ascii="Times New Roman" w:cs="Times New Roman" w:eastAsia="宋体" w:hAnsi="Times New Roman"/>
       <w:i/>
       <w:iCs/>
       <w:color w:themeColor="text1" w:themeTint="D8" w:val="272727"/>
@@ -5949,7 +6093,7 @@
       <w:outlineLvl w:val="8"/>
     </w:pPr>
     <w:rPr>
-      <w:rFonts w:cstheme="majorBidi" w:eastAsiaTheme="majorEastAsia"/>
+      <w:rFonts w:ascii="Times New Roman" w:cs="Times New Roman" w:eastAsia="宋体" w:hAnsi="Times New Roman"/>
       <w:color w:themeColor="text1" w:themeTint="D8" w:val="272727"/>
     </w:rPr>
   </w:style>
@@ -5960,7 +6104,7 @@
     <w:uiPriority w:val="9"/>
     <w:rsid w:val="00A10FD9"/>
     <w:rPr>
-      <w:rFonts w:asciiTheme="majorHAnsi" w:cstheme="majorBidi" w:eastAsiaTheme="majorEastAsia" w:hAnsiTheme="majorHAnsi"/>
+      <w:rFonts w:ascii="Times New Roman" w:cs="Times New Roman" w:eastAsia="宋体" w:hAnsi="Times New Roman"/>
       <w:color w:themeColor="accent1" w:themeShade="BF" w:val="0F4761"/>
       <w:sz w:val="40"/>
       <w:szCs w:val="40"/>
@@ -5974,7 +6118,7 @@
     <w:semiHidden/>
     <w:rsid w:val="00A10FD9"/>
     <w:rPr>
-      <w:rFonts w:asciiTheme="majorHAnsi" w:cstheme="majorBidi" w:eastAsiaTheme="majorEastAsia" w:hAnsiTheme="majorHAnsi"/>
+      <w:rFonts w:ascii="Times New Roman" w:cs="Times New Roman" w:eastAsia="宋体" w:hAnsi="Times New Roman"/>
       <w:color w:themeColor="accent1" w:themeShade="BF" w:val="0F4761"/>
       <w:sz w:val="32"/>
       <w:szCs w:val="32"/>
@@ -5988,7 +6132,7 @@
     <w:semiHidden/>
     <w:rsid w:val="00A10FD9"/>
     <w:rPr>
-      <w:rFonts w:cstheme="majorBidi" w:eastAsiaTheme="majorEastAsia"/>
+      <w:rFonts w:ascii="Times New Roman" w:cs="Times New Roman" w:eastAsia="宋体" w:hAnsi="Times New Roman"/>
       <w:color w:themeColor="accent1" w:themeShade="BF" w:val="0F4761"/>
       <w:sz w:val="28"/>
       <w:szCs w:val="28"/>
@@ -6002,7 +6146,7 @@
     <w:semiHidden/>
     <w:rsid w:val="00A10FD9"/>
     <w:rPr>
-      <w:rFonts w:cstheme="majorBidi" w:eastAsiaTheme="majorEastAsia"/>
+      <w:rFonts w:ascii="Times New Roman" w:cs="Times New Roman" w:eastAsia="宋体" w:hAnsi="Times New Roman"/>
       <w:i/>
       <w:iCs/>
       <w:color w:themeColor="accent1" w:themeShade="BF" w:val="0F4761"/>
@@ -6016,7 +6160,7 @@
     <w:semiHidden/>
     <w:rsid w:val="00A10FD9"/>
     <w:rPr>
-      <w:rFonts w:cstheme="majorBidi" w:eastAsiaTheme="majorEastAsia"/>
+      <w:rFonts w:ascii="Times New Roman" w:cs="Times New Roman" w:eastAsia="宋体" w:hAnsi="Times New Roman"/>
       <w:color w:themeColor="accent1" w:themeShade="BF" w:val="0F4761"/>
     </w:rPr>
   </w:style>
@@ -6028,7 +6172,7 @@
     <w:semiHidden/>
     <w:rsid w:val="00A10FD9"/>
     <w:rPr>
-      <w:rFonts w:cstheme="majorBidi" w:eastAsiaTheme="majorEastAsia"/>
+      <w:rFonts w:ascii="Times New Roman" w:cs="Times New Roman" w:eastAsia="宋体" w:hAnsi="Times New Roman"/>
       <w:i/>
       <w:iCs/>
       <w:color w:themeColor="text1" w:themeTint="A6" w:val="595959"/>
@@ -6042,7 +6186,7 @@
     <w:semiHidden/>
     <w:rsid w:val="00A10FD9"/>
     <w:rPr>
-      <w:rFonts w:cstheme="majorBidi" w:eastAsiaTheme="majorEastAsia"/>
+      <w:rFonts w:ascii="Times New Roman" w:cs="Times New Roman" w:eastAsia="宋体" w:hAnsi="Times New Roman"/>
       <w:color w:themeColor="text1" w:themeTint="A6" w:val="595959"/>
     </w:rPr>
   </w:style>
@@ -6054,7 +6198,7 @@
     <w:semiHidden/>
     <w:rsid w:val="00A10FD9"/>
     <w:rPr>
-      <w:rFonts w:cstheme="majorBidi" w:eastAsiaTheme="majorEastAsia"/>
+      <w:rFonts w:ascii="Times New Roman" w:cs="Times New Roman" w:eastAsia="宋体" w:hAnsi="Times New Roman"/>
       <w:i/>
       <w:iCs/>
       <w:color w:themeColor="text1" w:themeTint="D8" w:val="272727"/>
@@ -6068,7 +6212,7 @@
     <w:semiHidden/>
     <w:rsid w:val="00A10FD9"/>
     <w:rPr>
-      <w:rFonts w:cstheme="majorBidi" w:eastAsiaTheme="majorEastAsia"/>
+      <w:rFonts w:ascii="Times New Roman" w:cs="Times New Roman" w:eastAsia="宋体" w:hAnsi="Times New Roman"/>
       <w:color w:themeColor="text1" w:themeTint="D8" w:val="272727"/>
     </w:rPr>
   </w:style>
@@ -6192,7 +6336,7 @@
     <w:name w:val="Verbatim Char"/>
     <w:basedOn w:val="BodyTextChar"/>
     <w:rPr>
-      <w:rFonts w:ascii="Consolas" w:eastAsia="微软雅黑" w:hAnsi="Consolas"/>
+      <w:rFonts w:ascii="Times New Roman" w:cs="Times New Roman" w:eastAsia="宋体" w:hAnsi="Times New Roman"/>
       <w:sz w:val="22"/>
     </w:rPr>
   </w:style>
@@ -6226,7 +6370,7 @@
       <w:outlineLvl w:val="9"/>
     </w:pPr>
     <w:rPr>
-      <w:rFonts w:asciiTheme="majorHAnsi" w:cstheme="majorBidi" w:eastAsiaTheme="majorEastAsia" w:hAnsiTheme="majorHAnsi"/>
+      <w:rFonts w:ascii="Times New Roman" w:cs="Times New Roman" w:eastAsia="宋体" w:hAnsi="Times New Roman"/>
       <w:b w:val="0"/>
       <w:bCs w:val="0"/>
       <w:color w:themeColor="accent1" w:themeShade="BF" w:val="365F91"/>

</xml_diff>